<commit_message>
Modifico Casos de uso .md
</commit_message>
<xml_diff>
--- a/1-Entrega Personal/1 - Informe/Lumen_Informe_General.docx
+++ b/1-Entrega Personal/1 - Informe/Lumen_Informe_General.docx
@@ -1609,7 +1609,7 @@
         <w:t xml:space="preserve">RF-16: </w:t>
       </w:r>
       <w:r>
-        <w:t>El sistema debe permitir que el Profesor modifique únicamente cursos propios; al confirmar cambios, estos deben generar una nueva revisión administrativa antes de considerarse aprobados.</w:t>
+        <w:t>El sistema debe permitir que el Profesor modifique únicamente cursos propios. La edición de un curso BORRADOR conserva ese estado hasta que el Profesor solicita su envío a revisión. Las modificaciones de un curso PUBLICADO y las correcciones de un curso en CAMBIOS SOLICITADOS deben generar una nueva revisión administrativa al confirmarse, antes de considerarse aprobadas.</w:t>
       </w:r>
     </w:p>
     <w:p>
@@ -1623,7 +1623,7 @@
         <w:t xml:space="preserve">RF-17: </w:t>
       </w:r>
       <w:r>
-        <w:t>El sistema debe permitir que Profesor y Administrador pausen cursos según sus permisos.</w:t>
+        <w:t>El sistema debe permitir que Profesor y Administrador pausen cursos PUBLICADOS y reanuden cursos PAUSADOS según sus permisos. El Profesor solo puede hacerlo sobre cursos propios.</w:t>
       </w:r>
     </w:p>
     <w:p>
@@ -3059,7 +3059,7 @@
                 <w:b w:val="0"/>
                 <w:sz w:val="19"/>
               </w:rPr>
-              <w:t>Pausar curso</w:t>
+              <w:t>Pausar / reanudar curso</w:t>
             </w:r>
           </w:p>
         </w:tc>

</xml_diff>